<commit_message>
nmv 25 08 2026
</commit_message>
<xml_diff>
--- a/TS-Kramam/TS-4.5/TS 4.5 Malayalam Krama Paatam Corrections.docx
+++ b/TS-Kramam/TS-4.5/TS 4.5 Malayalam Krama Paatam Corrections.docx
@@ -81,7 +81,18 @@
           <w:szCs w:val="32"/>
           <w:u w:val="single"/>
         </w:rPr>
-        <w:t xml:space="preserve">Observed till </w:t>
+        <w:t xml:space="preserve">Observed </w:t>
+      </w:r>
+      <w:proofErr w:type="gramStart"/>
+      <w:r>
+        <w:rPr>
+          <w:b/>
+          <w:bCs/>
+          <w:sz w:val="32"/>
+          <w:szCs w:val="32"/>
+          <w:u w:val="single"/>
+        </w:rPr>
+        <w:t xml:space="preserve">till </w:t>
       </w:r>
       <w:r>
         <w:rPr>
@@ -94,6 +105,7 @@
         </w:rPr>
         <w:t>????</w:t>
       </w:r>
+      <w:proofErr w:type="gramEnd"/>
     </w:p>
     <w:p>
       <w:pPr>
@@ -250,25 +262,7 @@
                 <w:sz w:val="28"/>
                 <w:szCs w:val="32"/>
               </w:rPr>
-              <w:t>T.S.4.5.1</w:t>
-            </w:r>
-            <w:r>
-              <w:rPr>
-                <w:rFonts w:cs="Arial"/>
-                <w:b/>
-                <w:sz w:val="28"/>
-                <w:szCs w:val="32"/>
-              </w:rPr>
-              <w:t>1</w:t>
-            </w:r>
-            <w:r>
-              <w:rPr>
-                <w:rFonts w:cs="Arial"/>
-                <w:b/>
-                <w:sz w:val="28"/>
-                <w:szCs w:val="32"/>
-              </w:rPr>
-              <w:t>.</w:t>
+              <w:t>T.S.4.5.1.</w:t>
             </w:r>
             <w:r>
               <w:rPr>
@@ -326,7 +320,1266 @@
                 <w:szCs w:val="32"/>
                 <w:lang w:val="it-IT"/>
               </w:rPr>
-              <w:t>17</w:t>
+              <w:t>28</w:t>
+            </w:r>
+          </w:p>
+          <w:p>
+            <w:pPr>
+              <w:widowControl w:val="0"/>
+              <w:tabs>
+                <w:tab w:val="left" w:pos="993"/>
+              </w:tabs>
+              <w:autoSpaceDE w:val="0"/>
+              <w:autoSpaceDN w:val="0"/>
+              <w:adjustRightInd w:val="0"/>
+              <w:spacing w:before="0" w:line="252" w:lineRule="auto"/>
+              <w:ind w:right="297"/>
+              <w:rPr>
+                <w:rFonts w:cs="Arial"/>
+                <w:b/>
+                <w:sz w:val="28"/>
+                <w:szCs w:val="32"/>
+                <w:lang w:val="it-IT"/>
+              </w:rPr>
+            </w:pPr>
+            <w:r>
+              <w:rPr>
+                <w:rFonts w:cs="Arial"/>
+                <w:b/>
+                <w:sz w:val="28"/>
+                <w:szCs w:val="32"/>
+                <w:lang w:val="it-IT"/>
+              </w:rPr>
+              <w:t>Panchaati No</w:t>
+            </w:r>
+            <w:r>
+              <w:rPr>
+                <w:rFonts w:cs="Arial"/>
+                <w:b/>
+                <w:szCs w:val="32"/>
+                <w:lang w:val="it-IT"/>
+              </w:rPr>
+              <w:t xml:space="preserve">. </w:t>
+            </w:r>
+            <w:r>
+              <w:rPr>
+                <w:rFonts w:cs="Arial"/>
+                <w:b/>
+                <w:szCs w:val="32"/>
+                <w:lang w:val="it-IT"/>
+              </w:rPr>
+              <w:t>1</w:t>
+            </w:r>
+          </w:p>
+        </w:tc>
+        <w:tc>
+          <w:tcPr>
+            <w:tcW w:w="5103" w:type="dxa"/>
+          </w:tcPr>
+          <w:p>
+            <w:pPr>
+              <w:widowControl w:val="0"/>
+              <w:autoSpaceDE w:val="0"/>
+              <w:autoSpaceDN w:val="0"/>
+              <w:adjustRightInd w:val="0"/>
+              <w:spacing w:before="0" w:line="240" w:lineRule="auto"/>
+              <w:rPr>
+                <w:rFonts w:ascii="BRH Malayalam Extra" w:hAnsi="BRH Malayalam Extra" w:cs="BRH Malayalam Extra"/>
+                <w:color w:val="000000"/>
+                <w:sz w:val="40"/>
+                <w:szCs w:val="40"/>
+              </w:rPr>
+            </w:pPr>
+            <w:r>
+              <w:rPr>
+                <w:rFonts w:ascii="BRH Malayalam Extra" w:hAnsi="BRH Malayalam Extra" w:cs="BRH Malayalam Extra"/>
+                <w:color w:val="000000"/>
+                <w:sz w:val="40"/>
+                <w:szCs w:val="40"/>
+              </w:rPr>
+              <w:t>qy</w:t>
+            </w:r>
+            <w:r>
+              <w:rPr>
+                <w:rFonts w:ascii="BRH Malayalam Extra" w:hAnsi="BRH Malayalam Extra" w:cs="BRH Malayalam Extra"/>
+                <w:b/>
+                <w:color w:val="000000"/>
+                <w:sz w:val="32"/>
+                <w:szCs w:val="40"/>
+              </w:rPr>
+              <w:t>–</w:t>
+            </w:r>
+            <w:r>
+              <w:rPr>
+                <w:rFonts w:ascii="BRH Malayalam Extra" w:hAnsi="BRH Malayalam Extra" w:cs="BRH Malayalam Extra"/>
+                <w:color w:val="000000"/>
+                <w:sz w:val="40"/>
+                <w:szCs w:val="40"/>
+                <w:highlight w:val="yellow"/>
+              </w:rPr>
+              <w:t>p</w:t>
+            </w:r>
+            <w:r>
+              <w:rPr>
+                <w:rFonts w:ascii="BRH Malayalam Extra" w:hAnsi="BRH Malayalam Extra" w:cs="BRH Malayalam Extra"/>
+                <w:color w:val="000000"/>
+                <w:sz w:val="40"/>
+                <w:szCs w:val="40"/>
+              </w:rPr>
+              <w:t xml:space="preserve"> q—k</w:t>
+            </w:r>
+            <w:r>
+              <w:rPr>
+                <w:rFonts w:ascii="BRH Malayalam Extra" w:hAnsi="BRH Malayalam Extra" w:cs="BRH Malayalam Extra"/>
+                <w:b/>
+                <w:color w:val="000000"/>
+                <w:sz w:val="32"/>
+                <w:szCs w:val="40"/>
+              </w:rPr>
+              <w:t>–</w:t>
+            </w:r>
+            <w:r>
+              <w:rPr>
+                <w:rFonts w:ascii="BRH Malayalam Extra" w:hAnsi="BRH Malayalam Extra" w:cs="BRH Malayalam Extra"/>
+                <w:color w:val="000000"/>
+                <w:sz w:val="40"/>
+                <w:szCs w:val="40"/>
+              </w:rPr>
+              <w:t>põx˜ | q</w:t>
+            </w:r>
+            <w:r>
+              <w:rPr>
+                <w:rFonts w:ascii="BRH Malayalam Extra" w:hAnsi="BRH Malayalam Extra" w:cs="BRH Malayalam Extra"/>
+                <w:b/>
+                <w:color w:val="000000"/>
+                <w:sz w:val="32"/>
+                <w:szCs w:val="40"/>
+              </w:rPr>
+              <w:t>–</w:t>
+            </w:r>
+            <w:r>
+              <w:rPr>
+                <w:rFonts w:ascii="BRH Malayalam Extra" w:hAnsi="BRH Malayalam Extra" w:cs="BRH Malayalam Extra"/>
+                <w:color w:val="000000"/>
+                <w:sz w:val="40"/>
+                <w:szCs w:val="40"/>
+              </w:rPr>
+              <w:t>k</w:t>
+            </w:r>
+            <w:r>
+              <w:rPr>
+                <w:rFonts w:ascii="BRH Malayalam Extra" w:hAnsi="BRH Malayalam Extra" w:cs="BRH Malayalam Extra"/>
+                <w:b/>
+                <w:color w:val="000000"/>
+                <w:sz w:val="32"/>
+                <w:szCs w:val="40"/>
+              </w:rPr>
+              <w:t>–</w:t>
+            </w:r>
+            <w:r>
+              <w:rPr>
+                <w:rFonts w:ascii="BRH Malayalam Extra" w:hAnsi="BRH Malayalam Extra" w:cs="BRH Malayalam Extra"/>
+                <w:color w:val="000000"/>
+                <w:sz w:val="40"/>
+                <w:szCs w:val="40"/>
+              </w:rPr>
+              <w:t>põx— jx |</w:t>
+            </w:r>
+          </w:p>
+        </w:tc>
+        <w:tc>
+          <w:tcPr>
+            <w:tcW w:w="5386" w:type="dxa"/>
+          </w:tcPr>
+          <w:p>
+            <w:pPr>
+              <w:widowControl w:val="0"/>
+              <w:autoSpaceDE w:val="0"/>
+              <w:autoSpaceDN w:val="0"/>
+              <w:adjustRightInd w:val="0"/>
+              <w:spacing w:before="0" w:line="240" w:lineRule="auto"/>
+              <w:rPr>
+                <w:rFonts w:ascii="BRH Malayalam Extra" w:hAnsi="BRH Malayalam Extra" w:cs="BRH Malayalam Extra"/>
+                <w:color w:val="000000"/>
+                <w:sz w:val="40"/>
+                <w:szCs w:val="40"/>
+              </w:rPr>
+            </w:pPr>
+            <w:r>
+              <w:rPr>
+                <w:rFonts w:ascii="BRH Malayalam Extra" w:hAnsi="BRH Malayalam Extra" w:cs="BRH Malayalam Extra"/>
+                <w:color w:val="000000"/>
+                <w:sz w:val="40"/>
+                <w:szCs w:val="40"/>
+              </w:rPr>
+              <w:t>qy</w:t>
+            </w:r>
+            <w:r>
+              <w:rPr>
+                <w:rFonts w:ascii="BRH Malayalam Extra" w:hAnsi="BRH Malayalam Extra" w:cs="BRH Malayalam Extra"/>
+                <w:b/>
+                <w:color w:val="000000"/>
+                <w:sz w:val="32"/>
+                <w:szCs w:val="40"/>
+              </w:rPr>
+              <w:t>–</w:t>
+            </w:r>
+            <w:r>
+              <w:rPr>
+                <w:rFonts w:ascii="BRH Malayalam Extra" w:hAnsi="BRH Malayalam Extra" w:cs="BRH Malayalam Extra"/>
+                <w:color w:val="000000"/>
+                <w:sz w:val="40"/>
+                <w:szCs w:val="40"/>
+              </w:rPr>
+              <w:t>p</w:t>
+            </w:r>
+            <w:r>
+              <w:rPr>
+                <w:rFonts w:ascii="BRH Malayalam Extra" w:hAnsi="BRH Malayalam Extra" w:cs="BRH Malayalam Extra"/>
+                <w:color w:val="000000"/>
+                <w:sz w:val="40"/>
+                <w:szCs w:val="40"/>
+                <w:highlight w:val="green"/>
+              </w:rPr>
+              <w:t>x</w:t>
+            </w:r>
+            <w:r>
+              <w:rPr>
+                <w:rFonts w:ascii="BRH Malayalam Extra" w:hAnsi="BRH Malayalam Extra" w:cs="BRH Malayalam Extra"/>
+                <w:color w:val="000000"/>
+                <w:sz w:val="40"/>
+                <w:szCs w:val="40"/>
+              </w:rPr>
+              <w:t xml:space="preserve"> q—k</w:t>
+            </w:r>
+            <w:r>
+              <w:rPr>
+                <w:rFonts w:ascii="BRH Malayalam Extra" w:hAnsi="BRH Malayalam Extra" w:cs="BRH Malayalam Extra"/>
+                <w:b/>
+                <w:color w:val="000000"/>
+                <w:sz w:val="32"/>
+                <w:szCs w:val="40"/>
+              </w:rPr>
+              <w:t>–</w:t>
+            </w:r>
+            <w:r>
+              <w:rPr>
+                <w:rFonts w:ascii="BRH Malayalam Extra" w:hAnsi="BRH Malayalam Extra" w:cs="BRH Malayalam Extra"/>
+                <w:color w:val="000000"/>
+                <w:sz w:val="40"/>
+                <w:szCs w:val="40"/>
+              </w:rPr>
+              <w:t>põx˜ | q</w:t>
+            </w:r>
+            <w:r>
+              <w:rPr>
+                <w:rFonts w:ascii="BRH Malayalam Extra" w:hAnsi="BRH Malayalam Extra" w:cs="BRH Malayalam Extra"/>
+                <w:b/>
+                <w:color w:val="000000"/>
+                <w:sz w:val="32"/>
+                <w:szCs w:val="40"/>
+              </w:rPr>
+              <w:t>–</w:t>
+            </w:r>
+            <w:r>
+              <w:rPr>
+                <w:rFonts w:ascii="BRH Malayalam Extra" w:hAnsi="BRH Malayalam Extra" w:cs="BRH Malayalam Extra"/>
+                <w:color w:val="000000"/>
+                <w:sz w:val="40"/>
+                <w:szCs w:val="40"/>
+              </w:rPr>
+              <w:t>k</w:t>
+            </w:r>
+            <w:r>
+              <w:rPr>
+                <w:rFonts w:ascii="BRH Malayalam Extra" w:hAnsi="BRH Malayalam Extra" w:cs="BRH Malayalam Extra"/>
+                <w:b/>
+                <w:color w:val="000000"/>
+                <w:sz w:val="32"/>
+                <w:szCs w:val="40"/>
+              </w:rPr>
+              <w:t>–</w:t>
+            </w:r>
+            <w:r>
+              <w:rPr>
+                <w:rFonts w:ascii="BRH Malayalam Extra" w:hAnsi="BRH Malayalam Extra" w:cs="BRH Malayalam Extra"/>
+                <w:color w:val="000000"/>
+                <w:sz w:val="40"/>
+                <w:szCs w:val="40"/>
+              </w:rPr>
+              <w:t>põx— jx |</w:t>
+            </w:r>
+          </w:p>
+        </w:tc>
+      </w:tr>
+      <w:tr>
+        <w:trPr>
+          <w:trHeight w:val="1403"/>
+        </w:trPr>
+        <w:tc>
+          <w:tcPr>
+            <w:tcW w:w="3906" w:type="dxa"/>
+          </w:tcPr>
+          <w:p>
+            <w:pPr>
+              <w:widowControl w:val="0"/>
+              <w:tabs>
+                <w:tab w:val="left" w:pos="993"/>
+              </w:tabs>
+              <w:autoSpaceDE w:val="0"/>
+              <w:autoSpaceDN w:val="0"/>
+              <w:adjustRightInd w:val="0"/>
+              <w:spacing w:before="0" w:line="240" w:lineRule="auto"/>
+              <w:ind w:right="297"/>
+              <w:rPr>
+                <w:rFonts w:cs="Arial"/>
+                <w:b/>
+                <w:sz w:val="28"/>
+                <w:szCs w:val="32"/>
+              </w:rPr>
+            </w:pPr>
+            <w:r>
+              <w:rPr>
+                <w:rFonts w:cs="Arial"/>
+                <w:b/>
+                <w:sz w:val="28"/>
+                <w:szCs w:val="32"/>
+              </w:rPr>
+              <w:t>T.S.4.5.1.</w:t>
+            </w:r>
+            <w:r>
+              <w:rPr>
+                <w:rFonts w:cs="Arial"/>
+                <w:b/>
+                <w:sz w:val="28"/>
+                <w:szCs w:val="32"/>
+              </w:rPr>
+              <w:t>3</w:t>
+            </w:r>
+            <w:r>
+              <w:rPr>
+                <w:rFonts w:cs="Arial"/>
+                <w:b/>
+                <w:sz w:val="28"/>
+                <w:szCs w:val="32"/>
+              </w:rPr>
+              <w:t xml:space="preserve"> – Kramam</w:t>
+            </w:r>
+          </w:p>
+          <w:p>
+            <w:pPr>
+              <w:widowControl w:val="0"/>
+              <w:tabs>
+                <w:tab w:val="left" w:pos="993"/>
+              </w:tabs>
+              <w:autoSpaceDE w:val="0"/>
+              <w:autoSpaceDN w:val="0"/>
+              <w:adjustRightInd w:val="0"/>
+              <w:spacing w:before="0" w:line="240" w:lineRule="auto"/>
+              <w:ind w:right="297"/>
+              <w:rPr>
+                <w:rFonts w:cs="Arial"/>
+                <w:b/>
+                <w:sz w:val="28"/>
+                <w:szCs w:val="32"/>
+                <w:lang w:val="it-IT"/>
+              </w:rPr>
+            </w:pPr>
+            <w:r>
+              <w:rPr>
+                <w:rFonts w:cs="Arial"/>
+                <w:b/>
+                <w:sz w:val="28"/>
+                <w:szCs w:val="32"/>
+                <w:lang w:val="it-IT"/>
+              </w:rPr>
+              <w:t xml:space="preserve">Krama Vaakyam No.– </w:t>
+            </w:r>
+            <w:r>
+              <w:rPr>
+                <w:rFonts w:cs="Arial"/>
+                <w:b/>
+                <w:sz w:val="28"/>
+                <w:szCs w:val="32"/>
+                <w:lang w:val="it-IT"/>
+              </w:rPr>
+              <w:t>50</w:t>
+            </w:r>
+          </w:p>
+          <w:p>
+            <w:pPr>
+              <w:widowControl w:val="0"/>
+              <w:tabs>
+                <w:tab w:val="left" w:pos="993"/>
+              </w:tabs>
+              <w:autoSpaceDE w:val="0"/>
+              <w:autoSpaceDN w:val="0"/>
+              <w:adjustRightInd w:val="0"/>
+              <w:spacing w:before="0" w:line="240" w:lineRule="auto"/>
+              <w:ind w:right="297"/>
+              <w:rPr>
+                <w:rFonts w:cs="Arial"/>
+                <w:b/>
+                <w:sz w:val="28"/>
+                <w:szCs w:val="32"/>
+                <w:lang w:val="it-IT"/>
+              </w:rPr>
+            </w:pPr>
+            <w:r>
+              <w:rPr>
+                <w:rFonts w:cs="Arial"/>
+                <w:b/>
+                <w:sz w:val="28"/>
+                <w:szCs w:val="32"/>
+                <w:lang w:val="it-IT"/>
+              </w:rPr>
+              <w:t>Panchaati No</w:t>
+            </w:r>
+            <w:r>
+              <w:rPr>
+                <w:rFonts w:cs="Arial"/>
+                <w:b/>
+                <w:szCs w:val="32"/>
+                <w:lang w:val="it-IT"/>
+              </w:rPr>
+              <w:t xml:space="preserve">. </w:t>
+            </w:r>
+            <w:r>
+              <w:rPr>
+                <w:rFonts w:cs="Arial"/>
+                <w:b/>
+                <w:szCs w:val="32"/>
+                <w:lang w:val="it-IT"/>
+              </w:rPr>
+              <w:t>3</w:t>
+            </w:r>
+          </w:p>
+        </w:tc>
+        <w:tc>
+          <w:tcPr>
+            <w:tcW w:w="5103" w:type="dxa"/>
+          </w:tcPr>
+          <w:p>
+            <w:pPr>
+              <w:widowControl w:val="0"/>
+              <w:autoSpaceDE w:val="0"/>
+              <w:autoSpaceDN w:val="0"/>
+              <w:adjustRightInd w:val="0"/>
+              <w:spacing w:before="0" w:line="240" w:lineRule="auto"/>
+              <w:rPr>
+                <w:rFonts w:ascii="BRH Malayalam Extra" w:hAnsi="BRH Malayalam Extra" w:cs="BRH Malayalam Extra"/>
+                <w:color w:val="000000"/>
+                <w:sz w:val="40"/>
+                <w:szCs w:val="40"/>
+              </w:rPr>
+            </w:pPr>
+            <w:r>
+              <w:rPr>
+                <w:rFonts w:ascii="BRH Malayalam Extra" w:hAnsi="BRH Malayalam Extra" w:cs="BRH Malayalam Extra"/>
+                <w:color w:val="000000"/>
+                <w:sz w:val="40"/>
+                <w:szCs w:val="40"/>
+              </w:rPr>
+              <w:t>D</w:t>
+            </w:r>
+            <w:r>
+              <w:rPr>
+                <w:rFonts w:ascii="BRH Malayalam Extra" w:hAnsi="BRH Malayalam Extra" w:cs="BRH Malayalam Extra"/>
+                <w:b/>
+                <w:color w:val="000000"/>
+                <w:sz w:val="32"/>
+                <w:szCs w:val="40"/>
+              </w:rPr>
+              <w:t>–</w:t>
+            </w:r>
+            <w:r>
+              <w:rPr>
+                <w:rFonts w:ascii="BRH Malayalam Extra" w:hAnsi="BRH Malayalam Extra" w:cs="BRH Malayalam Extra"/>
+                <w:color w:val="000000"/>
+                <w:sz w:val="40"/>
+                <w:szCs w:val="40"/>
+              </w:rPr>
+              <w:t>h¥jx</w:t>
+            </w:r>
+            <w:r>
+              <w:rPr>
+                <w:rFonts w:ascii="BRH Malayalam Extra" w:hAnsi="BRH Malayalam Extra" w:cs="BRH Malayalam Extra"/>
+                <w:b/>
+                <w:color w:val="000000"/>
+                <w:sz w:val="32"/>
+                <w:szCs w:val="40"/>
+              </w:rPr>
+              <w:t>–</w:t>
+            </w:r>
+            <w:r>
+              <w:rPr>
+                <w:rFonts w:ascii="BRH Malayalam Extra" w:hAnsi="BRH Malayalam Extra" w:cs="BRH Malayalam Extra"/>
+                <w:color w:val="000000"/>
+                <w:sz w:val="40"/>
+                <w:szCs w:val="40"/>
+                <w:highlight w:val="yellow"/>
+              </w:rPr>
+              <w:t>kxÙ</w:t>
+            </w:r>
+            <w:r>
+              <w:rPr>
+                <w:rFonts w:ascii="BRH Malayalam Extra" w:hAnsi="BRH Malayalam Extra" w:cs="BRH Malayalam Extra"/>
+                <w:color w:val="000000"/>
+                <w:sz w:val="40"/>
+                <w:szCs w:val="40"/>
+              </w:rPr>
+              <w:t xml:space="preserve">y—¥jxJ | </w:t>
+            </w:r>
+          </w:p>
+          <w:p>
+            <w:pPr>
+              <w:widowControl w:val="0"/>
+              <w:autoSpaceDE w:val="0"/>
+              <w:autoSpaceDN w:val="0"/>
+              <w:adjustRightInd w:val="0"/>
+              <w:spacing w:before="0" w:line="240" w:lineRule="auto"/>
+              <w:rPr>
+                <w:rFonts w:ascii="BRH Malayalam Extra" w:hAnsi="BRH Malayalam Extra" w:cs="BRH Malayalam Extra"/>
+                <w:color w:val="000000"/>
+                <w:sz w:val="40"/>
+                <w:szCs w:val="40"/>
+              </w:rPr>
+            </w:pPr>
+            <w:r>
+              <w:rPr>
+                <w:rFonts w:ascii="BRH Malayalam Extra" w:hAnsi="BRH Malayalam Extra" w:cs="BRH Malayalam Extra"/>
+                <w:color w:val="000000"/>
+                <w:sz w:val="40"/>
+                <w:szCs w:val="40"/>
+              </w:rPr>
+              <w:t>B</w:t>
+            </w:r>
+            <w:r>
+              <w:rPr>
+                <w:rFonts w:ascii="BRH Malayalam Extra" w:hAnsi="BRH Malayalam Extra" w:cs="BRH Malayalam Extra"/>
+                <w:color w:val="000000"/>
+                <w:sz w:val="40"/>
+                <w:szCs w:val="40"/>
+              </w:rPr>
+              <w:t>ª</w:t>
+            </w:r>
+            <w:r>
+              <w:rPr>
+                <w:rFonts w:ascii="BRH Malayalam Extra" w:hAnsi="BRH Malayalam Extra" w:cs="BRH Malayalam Extra"/>
+                <w:color w:val="000000"/>
+                <w:sz w:val="40"/>
+                <w:szCs w:val="40"/>
+              </w:rPr>
+              <w:t>Ùy—¥jx</w:t>
+            </w:r>
+            <w:r>
+              <w:rPr>
+                <w:rFonts w:ascii="BRH Malayalam Extra" w:hAnsi="BRH Malayalam Extra" w:cs="BRH Malayalam Extra"/>
+                <w:b/>
+                <w:color w:val="000000"/>
+                <w:sz w:val="32"/>
+                <w:szCs w:val="40"/>
+              </w:rPr>
+              <w:t>–</w:t>
+            </w:r>
+            <w:r>
+              <w:rPr>
+                <w:rFonts w:ascii="BRH Malayalam Extra" w:hAnsi="BRH Malayalam Extra" w:cs="BRH Malayalam Extra"/>
+                <w:color w:val="000000"/>
+                <w:sz w:val="40"/>
+                <w:szCs w:val="40"/>
+              </w:rPr>
+              <w:t>ª</w:t>
+            </w:r>
+            <w:r>
+              <w:rPr>
+                <w:rFonts w:ascii="BRH Malayalam Extra" w:hAnsi="BRH Malayalam Extra" w:cs="BRH Malayalam Extra"/>
+                <w:color w:val="000000"/>
+                <w:sz w:val="40"/>
+                <w:szCs w:val="40"/>
+              </w:rPr>
+              <w:t>Rõx</w:t>
+            </w:r>
+            <w:r>
+              <w:rPr>
+                <w:rFonts w:ascii="BRH Malayalam Extra" w:hAnsi="BRH Malayalam Extra" w:cs="BRH Malayalam Extra"/>
+                <w:color w:val="000000"/>
+                <w:sz w:val="40"/>
+                <w:szCs w:val="40"/>
+              </w:rPr>
+              <w:t>I</w:t>
+            </w:r>
+            <w:r>
+              <w:rPr>
+                <w:rFonts w:ascii="BRH Malayalam Extra" w:hAnsi="BRH Malayalam Extra" w:cs="BRH Malayalam Extra"/>
+                <w:color w:val="000000"/>
+                <w:sz w:val="40"/>
+                <w:szCs w:val="40"/>
+              </w:rPr>
+              <w:t xml:space="preserve"> |</w:t>
+            </w:r>
+          </w:p>
+        </w:tc>
+        <w:tc>
+          <w:tcPr>
+            <w:tcW w:w="5386" w:type="dxa"/>
+          </w:tcPr>
+          <w:p>
+            <w:pPr>
+              <w:widowControl w:val="0"/>
+              <w:autoSpaceDE w:val="0"/>
+              <w:autoSpaceDN w:val="0"/>
+              <w:adjustRightInd w:val="0"/>
+              <w:spacing w:before="0" w:line="240" w:lineRule="auto"/>
+              <w:rPr>
+                <w:rFonts w:ascii="BRH Malayalam Extra" w:hAnsi="BRH Malayalam Extra" w:cs="BRH Malayalam Extra"/>
+                <w:color w:val="000000"/>
+                <w:sz w:val="40"/>
+                <w:szCs w:val="40"/>
+              </w:rPr>
+            </w:pPr>
+            <w:r>
+              <w:rPr>
+                <w:rFonts w:ascii="BRH Malayalam Extra" w:hAnsi="BRH Malayalam Extra" w:cs="BRH Malayalam Extra"/>
+                <w:color w:val="000000"/>
+                <w:sz w:val="40"/>
+                <w:szCs w:val="40"/>
+              </w:rPr>
+              <w:t>D</w:t>
+            </w:r>
+            <w:r>
+              <w:rPr>
+                <w:rFonts w:ascii="BRH Malayalam Extra" w:hAnsi="BRH Malayalam Extra" w:cs="BRH Malayalam Extra"/>
+                <w:b/>
+                <w:color w:val="000000"/>
+                <w:sz w:val="32"/>
+                <w:szCs w:val="40"/>
+              </w:rPr>
+              <w:t>–</w:t>
+            </w:r>
+            <w:r>
+              <w:rPr>
+                <w:rFonts w:ascii="BRH Malayalam Extra" w:hAnsi="BRH Malayalam Extra" w:cs="BRH Malayalam Extra"/>
+                <w:color w:val="000000"/>
+                <w:sz w:val="40"/>
+                <w:szCs w:val="40"/>
+              </w:rPr>
+              <w:t>h¥jx</w:t>
+            </w:r>
+            <w:r>
+              <w:rPr>
+                <w:rFonts w:ascii="BRH Malayalam Extra" w:hAnsi="BRH Malayalam Extra" w:cs="BRH Malayalam Extra"/>
+                <w:b/>
+                <w:color w:val="000000"/>
+                <w:sz w:val="32"/>
+                <w:szCs w:val="40"/>
+              </w:rPr>
+              <w:t>–</w:t>
+            </w:r>
+            <w:r>
+              <w:rPr>
+                <w:rFonts w:ascii="BRH Malayalam Extra" w:hAnsi="BRH Malayalam Extra" w:cs="BRH Malayalam Extra"/>
+                <w:color w:val="000000"/>
+                <w:sz w:val="40"/>
+                <w:szCs w:val="40"/>
+              </w:rPr>
+              <w:t>kx</w:t>
+            </w:r>
+            <w:r>
+              <w:rPr>
+                <w:rFonts w:ascii="BRH Malayalam Extra" w:hAnsi="BRH Malayalam Extra" w:cs="BRH Malayalam Extra"/>
+                <w:color w:val="000000"/>
+                <w:sz w:val="40"/>
+                <w:szCs w:val="40"/>
+                <w:highlight w:val="green"/>
+              </w:rPr>
+              <w:t>ª</w:t>
+            </w:r>
+            <w:r>
+              <w:rPr>
+                <w:rFonts w:ascii="BRH Malayalam Extra" w:hAnsi="BRH Malayalam Extra" w:cs="BRH Malayalam Extra"/>
+                <w:color w:val="000000"/>
+                <w:sz w:val="40"/>
+                <w:szCs w:val="40"/>
+              </w:rPr>
+              <w:t xml:space="preserve">Ùy—¥jxJ | </w:t>
+            </w:r>
+          </w:p>
+          <w:p>
+            <w:pPr>
+              <w:widowControl w:val="0"/>
+              <w:autoSpaceDE w:val="0"/>
+              <w:autoSpaceDN w:val="0"/>
+              <w:adjustRightInd w:val="0"/>
+              <w:spacing w:before="0" w:line="240" w:lineRule="auto"/>
+              <w:rPr>
+                <w:rFonts w:ascii="BRH Malayalam Extra" w:hAnsi="BRH Malayalam Extra" w:cs="BRH Malayalam Extra"/>
+                <w:color w:val="000000"/>
+                <w:sz w:val="40"/>
+                <w:szCs w:val="40"/>
+              </w:rPr>
+            </w:pPr>
+            <w:r>
+              <w:rPr>
+                <w:rFonts w:ascii="BRH Malayalam Extra" w:hAnsi="BRH Malayalam Extra" w:cs="BRH Malayalam Extra"/>
+                <w:color w:val="000000"/>
+                <w:sz w:val="40"/>
+                <w:szCs w:val="40"/>
+              </w:rPr>
+              <w:t>B</w:t>
+            </w:r>
+            <w:r>
+              <w:rPr>
+                <w:rFonts w:ascii="BRH Malayalam Extra" w:hAnsi="BRH Malayalam Extra" w:cs="BRH Malayalam Extra"/>
+                <w:color w:val="000000"/>
+                <w:sz w:val="40"/>
+                <w:szCs w:val="40"/>
+              </w:rPr>
+              <w:t>ª</w:t>
+            </w:r>
+            <w:r>
+              <w:rPr>
+                <w:rFonts w:ascii="BRH Malayalam Extra" w:hAnsi="BRH Malayalam Extra" w:cs="BRH Malayalam Extra"/>
+                <w:color w:val="000000"/>
+                <w:sz w:val="40"/>
+                <w:szCs w:val="40"/>
+              </w:rPr>
+              <w:t>Ùy—¥jx</w:t>
+            </w:r>
+            <w:r>
+              <w:rPr>
+                <w:rFonts w:ascii="BRH Malayalam Extra" w:hAnsi="BRH Malayalam Extra" w:cs="BRH Malayalam Extra"/>
+                <w:b/>
+                <w:color w:val="000000"/>
+                <w:sz w:val="32"/>
+                <w:szCs w:val="40"/>
+              </w:rPr>
+              <w:t>–</w:t>
+            </w:r>
+            <w:r>
+              <w:rPr>
+                <w:rFonts w:ascii="BRH Malayalam Extra" w:hAnsi="BRH Malayalam Extra" w:cs="BRH Malayalam Extra"/>
+                <w:color w:val="000000"/>
+                <w:sz w:val="40"/>
+                <w:szCs w:val="40"/>
+              </w:rPr>
+              <w:t>ª</w:t>
+            </w:r>
+            <w:r>
+              <w:rPr>
+                <w:rFonts w:ascii="BRH Malayalam Extra" w:hAnsi="BRH Malayalam Extra" w:cs="BRH Malayalam Extra"/>
+                <w:color w:val="000000"/>
+                <w:sz w:val="40"/>
+                <w:szCs w:val="40"/>
+              </w:rPr>
+              <w:t>Rõx</w:t>
+            </w:r>
+            <w:r>
+              <w:rPr>
+                <w:rFonts w:ascii="BRH Malayalam Extra" w:hAnsi="BRH Malayalam Extra" w:cs="BRH Malayalam Extra"/>
+                <w:color w:val="000000"/>
+                <w:sz w:val="40"/>
+                <w:szCs w:val="40"/>
+              </w:rPr>
+              <w:t>I</w:t>
+            </w:r>
+            <w:r>
+              <w:rPr>
+                <w:rFonts w:ascii="BRH Malayalam Extra" w:hAnsi="BRH Malayalam Extra" w:cs="BRH Malayalam Extra"/>
+                <w:color w:val="000000"/>
+                <w:sz w:val="40"/>
+                <w:szCs w:val="40"/>
+              </w:rPr>
+              <w:t xml:space="preserve"> |</w:t>
+            </w:r>
+          </w:p>
+        </w:tc>
+      </w:tr>
+      <w:tr>
+        <w:trPr>
+          <w:trHeight w:val="1409"/>
+        </w:trPr>
+        <w:tc>
+          <w:tcPr>
+            <w:tcW w:w="3906" w:type="dxa"/>
+          </w:tcPr>
+          <w:p>
+            <w:pPr>
+              <w:widowControl w:val="0"/>
+              <w:tabs>
+                <w:tab w:val="left" w:pos="993"/>
+              </w:tabs>
+              <w:autoSpaceDE w:val="0"/>
+              <w:autoSpaceDN w:val="0"/>
+              <w:adjustRightInd w:val="0"/>
+              <w:spacing w:before="0" w:line="240" w:lineRule="auto"/>
+              <w:ind w:right="297"/>
+              <w:rPr>
+                <w:rFonts w:cs="Arial"/>
+                <w:b/>
+                <w:sz w:val="28"/>
+                <w:szCs w:val="32"/>
+              </w:rPr>
+            </w:pPr>
+            <w:r>
+              <w:rPr>
+                <w:rFonts w:cs="Arial"/>
+                <w:b/>
+                <w:sz w:val="28"/>
+                <w:szCs w:val="32"/>
+              </w:rPr>
+              <w:t>T.S.4.5.</w:t>
+            </w:r>
+            <w:r>
+              <w:rPr>
+                <w:rFonts w:cs="Arial"/>
+                <w:b/>
+                <w:sz w:val="28"/>
+                <w:szCs w:val="32"/>
+              </w:rPr>
+              <w:t>2</w:t>
+            </w:r>
+            <w:r>
+              <w:rPr>
+                <w:rFonts w:cs="Arial"/>
+                <w:b/>
+                <w:sz w:val="28"/>
+                <w:szCs w:val="32"/>
+              </w:rPr>
+              <w:t>.</w:t>
+            </w:r>
+            <w:r>
+              <w:rPr>
+                <w:rFonts w:cs="Arial"/>
+                <w:b/>
+                <w:sz w:val="28"/>
+                <w:szCs w:val="32"/>
+              </w:rPr>
+              <w:t>2</w:t>
+            </w:r>
+            <w:r>
+              <w:rPr>
+                <w:rFonts w:cs="Arial"/>
+                <w:b/>
+                <w:sz w:val="28"/>
+                <w:szCs w:val="32"/>
+              </w:rPr>
+              <w:t xml:space="preserve"> – Kramam</w:t>
+            </w:r>
+          </w:p>
+          <w:p>
+            <w:pPr>
+              <w:widowControl w:val="0"/>
+              <w:tabs>
+                <w:tab w:val="left" w:pos="993"/>
+              </w:tabs>
+              <w:autoSpaceDE w:val="0"/>
+              <w:autoSpaceDN w:val="0"/>
+              <w:adjustRightInd w:val="0"/>
+              <w:spacing w:before="0" w:line="240" w:lineRule="auto"/>
+              <w:ind w:right="297"/>
+              <w:rPr>
+                <w:rFonts w:cs="Arial"/>
+                <w:b/>
+                <w:sz w:val="28"/>
+                <w:szCs w:val="32"/>
+                <w:lang w:val="it-IT"/>
+              </w:rPr>
+            </w:pPr>
+            <w:r>
+              <w:rPr>
+                <w:rFonts w:cs="Arial"/>
+                <w:b/>
+                <w:sz w:val="28"/>
+                <w:szCs w:val="32"/>
+                <w:lang w:val="it-IT"/>
+              </w:rPr>
+              <w:t xml:space="preserve">Krama Vaakyam No.– </w:t>
+            </w:r>
+            <w:r>
+              <w:rPr>
+                <w:rFonts w:cs="Arial"/>
+                <w:b/>
+                <w:sz w:val="28"/>
+                <w:szCs w:val="32"/>
+                <w:lang w:val="it-IT"/>
+              </w:rPr>
+              <w:t>30</w:t>
+            </w:r>
+          </w:p>
+          <w:p>
+            <w:pPr>
+              <w:widowControl w:val="0"/>
+              <w:tabs>
+                <w:tab w:val="left" w:pos="993"/>
+              </w:tabs>
+              <w:autoSpaceDE w:val="0"/>
+              <w:autoSpaceDN w:val="0"/>
+              <w:adjustRightInd w:val="0"/>
+              <w:spacing w:before="0" w:line="240" w:lineRule="auto"/>
+              <w:ind w:right="297"/>
+              <w:rPr>
+                <w:rFonts w:cs="Arial"/>
+                <w:b/>
+                <w:sz w:val="28"/>
+                <w:szCs w:val="32"/>
+                <w:lang w:val="it-IT"/>
+              </w:rPr>
+            </w:pPr>
+            <w:r>
+              <w:rPr>
+                <w:rFonts w:cs="Arial"/>
+                <w:b/>
+                <w:sz w:val="28"/>
+                <w:szCs w:val="32"/>
+                <w:lang w:val="it-IT"/>
+              </w:rPr>
+              <w:t>Panchaati No</w:t>
+            </w:r>
+            <w:r>
+              <w:rPr>
+                <w:rFonts w:cs="Arial"/>
+                <w:b/>
+                <w:szCs w:val="32"/>
+                <w:lang w:val="it-IT"/>
+              </w:rPr>
+              <w:t xml:space="preserve">. </w:t>
+            </w:r>
+            <w:r>
+              <w:rPr>
+                <w:rFonts w:cs="Arial"/>
+                <w:b/>
+                <w:szCs w:val="32"/>
+                <w:lang w:val="it-IT"/>
+              </w:rPr>
+              <w:t>6</w:t>
+            </w:r>
+          </w:p>
+        </w:tc>
+        <w:tc>
+          <w:tcPr>
+            <w:tcW w:w="5103" w:type="dxa"/>
+          </w:tcPr>
+          <w:p>
+            <w:pPr>
+              <w:widowControl w:val="0"/>
+              <w:autoSpaceDE w:val="0"/>
+              <w:autoSpaceDN w:val="0"/>
+              <w:adjustRightInd w:val="0"/>
+              <w:spacing w:before="0" w:line="240" w:lineRule="auto"/>
+              <w:rPr>
+                <w:rFonts w:ascii="BRH Malayalam Extra" w:hAnsi="BRH Malayalam Extra" w:cs="BRH Malayalam Extra"/>
+                <w:color w:val="000000"/>
+                <w:sz w:val="40"/>
+                <w:szCs w:val="40"/>
+              </w:rPr>
+            </w:pPr>
+            <w:r>
+              <w:rPr>
+                <w:rFonts w:ascii="BRH Malayalam Extra" w:hAnsi="BRH Malayalam Extra" w:cs="BRH Malayalam Extra"/>
+                <w:color w:val="000000"/>
+                <w:sz w:val="40"/>
+                <w:szCs w:val="40"/>
+              </w:rPr>
+              <w:t>cx</w:t>
+            </w:r>
+            <w:r>
+              <w:rPr>
+                <w:rFonts w:ascii="BRH Malayalam Extra" w:hAnsi="BRH Malayalam Extra" w:cs="BRH Malayalam Extra"/>
+                <w:color w:val="000000"/>
+                <w:sz w:val="40"/>
+                <w:szCs w:val="40"/>
+                <w:highlight w:val="yellow"/>
+              </w:rPr>
+              <w:t>¥</w:t>
+            </w:r>
+            <w:r>
+              <w:rPr>
+                <w:rFonts w:ascii="BRH Malayalam Extra" w:hAnsi="BRH Malayalam Extra" w:cs="BRH Malayalam Extra"/>
+                <w:color w:val="000000"/>
+                <w:sz w:val="40"/>
+                <w:szCs w:val="40"/>
+              </w:rPr>
+              <w:t>p—¥Z</w:t>
+            </w:r>
+            <w:r>
+              <w:rPr>
+                <w:rFonts w:ascii="BRH Malayalam Extra" w:hAnsi="BRH Malayalam Extra" w:cs="BRH Malayalam Extra"/>
+                <w:b/>
+                <w:color w:val="000000"/>
+                <w:sz w:val="32"/>
+                <w:szCs w:val="40"/>
+              </w:rPr>
+              <w:t>–</w:t>
+            </w:r>
+            <w:r>
+              <w:rPr>
+                <w:rFonts w:ascii="BRH Malayalam Extra" w:hAnsi="BRH Malayalam Extra" w:cs="BRH Malayalam Extra"/>
+                <w:color w:val="000000"/>
+                <w:sz w:val="40"/>
+                <w:szCs w:val="40"/>
+              </w:rPr>
+              <w:t xml:space="preserve"> sZû—dxI | </w:t>
+            </w:r>
+          </w:p>
+          <w:p>
+            <w:pPr>
+              <w:widowControl w:val="0"/>
+              <w:autoSpaceDE w:val="0"/>
+              <w:autoSpaceDN w:val="0"/>
+              <w:adjustRightInd w:val="0"/>
+              <w:spacing w:before="0" w:line="240" w:lineRule="auto"/>
+              <w:rPr>
+                <w:rFonts w:ascii="BRH Malayalam Extra" w:hAnsi="BRH Malayalam Extra" w:cs="BRH Malayalam Extra"/>
+                <w:color w:val="000000"/>
+                <w:sz w:val="40"/>
+                <w:szCs w:val="40"/>
+              </w:rPr>
+            </w:pPr>
+            <w:r>
+              <w:rPr>
+                <w:rFonts w:ascii="BRH Malayalam Extra" w:hAnsi="BRH Malayalam Extra" w:cs="BRH Malayalam Extra"/>
+                <w:color w:val="000000"/>
+                <w:sz w:val="40"/>
+                <w:szCs w:val="40"/>
+                <w:lang w:val="it-IT"/>
+              </w:rPr>
+              <w:t>sZû—dx</w:t>
+            </w:r>
+            <w:r>
+              <w:rPr>
+                <w:rFonts w:ascii="BRH Malayalam Extra" w:hAnsi="BRH Malayalam Extra" w:cs="BRH Malayalam Extra"/>
+                <w:b/>
+                <w:color w:val="000000"/>
+                <w:sz w:val="32"/>
+                <w:szCs w:val="40"/>
+                <w:lang w:val="it-IT"/>
+              </w:rPr>
+              <w:t>–</w:t>
+            </w:r>
+            <w:r>
+              <w:rPr>
+                <w:rFonts w:ascii="BRH Malayalam Extra" w:hAnsi="BRH Malayalam Extra" w:cs="BRH Malayalam Extra"/>
+                <w:color w:val="000000"/>
+                <w:sz w:val="40"/>
+                <w:szCs w:val="40"/>
+                <w:lang w:val="it-IT"/>
+              </w:rPr>
+              <w:t>I eZ—¥j |</w:t>
+            </w:r>
+          </w:p>
+        </w:tc>
+        <w:tc>
+          <w:tcPr>
+            <w:tcW w:w="5386" w:type="dxa"/>
+          </w:tcPr>
+          <w:p>
+            <w:pPr>
+              <w:widowControl w:val="0"/>
+              <w:autoSpaceDE w:val="0"/>
+              <w:autoSpaceDN w:val="0"/>
+              <w:adjustRightInd w:val="0"/>
+              <w:spacing w:before="0" w:line="240" w:lineRule="auto"/>
+              <w:rPr>
+                <w:rFonts w:ascii="BRH Malayalam Extra" w:hAnsi="BRH Malayalam Extra" w:cs="BRH Malayalam Extra"/>
+                <w:color w:val="000000"/>
+                <w:sz w:val="40"/>
+                <w:szCs w:val="40"/>
+              </w:rPr>
+            </w:pPr>
+            <w:r>
+              <w:rPr>
+                <w:rFonts w:ascii="BRH Malayalam Extra" w:hAnsi="BRH Malayalam Extra" w:cs="BRH Malayalam Extra"/>
+                <w:color w:val="000000"/>
+                <w:sz w:val="40"/>
+                <w:szCs w:val="40"/>
+              </w:rPr>
+              <w:t>cx</w:t>
+            </w:r>
+            <w:r>
+              <w:rPr>
+                <w:rFonts w:ascii="BRH Malayalam Extra" w:hAnsi="BRH Malayalam Extra" w:cs="BRH Malayalam Extra"/>
+                <w:color w:val="000000"/>
+                <w:sz w:val="40"/>
+                <w:szCs w:val="40"/>
+                <w:highlight w:val="green"/>
+              </w:rPr>
+              <w:t>p</w:t>
+            </w:r>
+            <w:r>
+              <w:rPr>
+                <w:rFonts w:ascii="BRH Malayalam Extra" w:hAnsi="BRH Malayalam Extra" w:cs="BRH Malayalam Extra"/>
+                <w:color w:val="000000"/>
+                <w:sz w:val="40"/>
+                <w:szCs w:val="40"/>
+              </w:rPr>
+              <w:t>—¥Z</w:t>
+            </w:r>
+            <w:r>
+              <w:rPr>
+                <w:rFonts w:ascii="BRH Malayalam Extra" w:hAnsi="BRH Malayalam Extra" w:cs="BRH Malayalam Extra"/>
+                <w:b/>
+                <w:color w:val="000000"/>
+                <w:sz w:val="32"/>
+                <w:szCs w:val="40"/>
+              </w:rPr>
+              <w:t>–</w:t>
+            </w:r>
+            <w:r>
+              <w:rPr>
+                <w:rFonts w:ascii="BRH Malayalam Extra" w:hAnsi="BRH Malayalam Extra" w:cs="BRH Malayalam Extra"/>
+                <w:color w:val="000000"/>
+                <w:sz w:val="40"/>
+                <w:szCs w:val="40"/>
+              </w:rPr>
+              <w:t xml:space="preserve"> sZû—dxI | </w:t>
+            </w:r>
+          </w:p>
+          <w:p>
+            <w:pPr>
+              <w:widowControl w:val="0"/>
+              <w:autoSpaceDE w:val="0"/>
+              <w:autoSpaceDN w:val="0"/>
+              <w:adjustRightInd w:val="0"/>
+              <w:spacing w:before="0" w:line="240" w:lineRule="auto"/>
+              <w:rPr>
+                <w:rFonts w:ascii="BRH Malayalam Extra" w:hAnsi="BRH Malayalam Extra" w:cs="BRH Malayalam Extra"/>
+                <w:color w:val="000000"/>
+                <w:sz w:val="40"/>
+                <w:szCs w:val="40"/>
+              </w:rPr>
+            </w:pPr>
+            <w:r>
+              <w:rPr>
+                <w:rFonts w:ascii="BRH Malayalam Extra" w:hAnsi="BRH Malayalam Extra" w:cs="BRH Malayalam Extra"/>
+                <w:color w:val="000000"/>
+                <w:sz w:val="40"/>
+                <w:szCs w:val="40"/>
+              </w:rPr>
+              <w:t>sZû—dx</w:t>
+            </w:r>
+            <w:r>
+              <w:rPr>
+                <w:rFonts w:ascii="BRH Malayalam Extra" w:hAnsi="BRH Malayalam Extra" w:cs="BRH Malayalam Extra"/>
+                <w:b/>
+                <w:color w:val="000000"/>
+                <w:sz w:val="32"/>
+                <w:szCs w:val="40"/>
+              </w:rPr>
+              <w:t>–</w:t>
+            </w:r>
+            <w:r>
+              <w:rPr>
+                <w:rFonts w:ascii="BRH Malayalam Extra" w:hAnsi="BRH Malayalam Extra" w:cs="BRH Malayalam Extra"/>
+                <w:color w:val="000000"/>
+                <w:sz w:val="40"/>
+                <w:szCs w:val="40"/>
+              </w:rPr>
+              <w:t>I eZ—¥j |</w:t>
+            </w:r>
+          </w:p>
+        </w:tc>
+      </w:tr>
+      <w:tr>
+        <w:trPr>
+          <w:trHeight w:val="1118"/>
+        </w:trPr>
+        <w:tc>
+          <w:tcPr>
+            <w:tcW w:w="3906" w:type="dxa"/>
+          </w:tcPr>
+          <w:p>
+            <w:pPr>
+              <w:widowControl w:val="0"/>
+              <w:tabs>
+                <w:tab w:val="left" w:pos="993"/>
+              </w:tabs>
+              <w:autoSpaceDE w:val="0"/>
+              <w:autoSpaceDN w:val="0"/>
+              <w:adjustRightInd w:val="0"/>
+              <w:spacing w:before="0" w:line="252" w:lineRule="auto"/>
+              <w:ind w:right="297"/>
+              <w:rPr>
+                <w:rFonts w:cs="Arial"/>
+                <w:b/>
+                <w:sz w:val="28"/>
+                <w:szCs w:val="32"/>
+              </w:rPr>
+            </w:pPr>
+            <w:r>
+              <w:rPr>
+                <w:rFonts w:cs="Arial"/>
+                <w:b/>
+                <w:sz w:val="28"/>
+                <w:szCs w:val="32"/>
+              </w:rPr>
+              <w:t>T.S.4.5.1</w:t>
+            </w:r>
+            <w:r>
+              <w:rPr>
+                <w:rFonts w:cs="Arial"/>
+                <w:b/>
+                <w:sz w:val="28"/>
+                <w:szCs w:val="32"/>
+              </w:rPr>
+              <w:t>1</w:t>
+            </w:r>
+            <w:r>
+              <w:rPr>
+                <w:rFonts w:cs="Arial"/>
+                <w:b/>
+                <w:sz w:val="28"/>
+                <w:szCs w:val="32"/>
+              </w:rPr>
+              <w:t>.</w:t>
+            </w:r>
+            <w:r>
+              <w:rPr>
+                <w:rFonts w:cs="Arial"/>
+                <w:b/>
+                <w:sz w:val="28"/>
+                <w:szCs w:val="32"/>
+              </w:rPr>
+              <w:t>1</w:t>
+            </w:r>
+            <w:r>
+              <w:rPr>
+                <w:rFonts w:cs="Arial"/>
+                <w:b/>
+                <w:sz w:val="28"/>
+                <w:szCs w:val="32"/>
+              </w:rPr>
+              <w:t xml:space="preserve"> – Kramam</w:t>
+            </w:r>
+          </w:p>
+          <w:p>
+            <w:pPr>
+              <w:widowControl w:val="0"/>
+              <w:tabs>
+                <w:tab w:val="left" w:pos="993"/>
+              </w:tabs>
+              <w:autoSpaceDE w:val="0"/>
+              <w:autoSpaceDN w:val="0"/>
+              <w:adjustRightInd w:val="0"/>
+              <w:spacing w:before="0" w:line="252" w:lineRule="auto"/>
+              <w:ind w:right="297"/>
+              <w:rPr>
+                <w:rFonts w:cs="Arial"/>
+                <w:b/>
+                <w:sz w:val="28"/>
+                <w:szCs w:val="32"/>
+                <w:lang w:val="en-IN"/>
+              </w:rPr>
+            </w:pPr>
+            <w:r>
+              <w:rPr>
+                <w:rFonts w:cs="Arial"/>
+                <w:b/>
+                <w:sz w:val="28"/>
+                <w:szCs w:val="32"/>
+                <w:lang w:val="en-IN"/>
+              </w:rPr>
+              <w:t>Krama Vaakyam No.– 17</w:t>
             </w:r>
           </w:p>
           <w:p>
@@ -701,6 +1954,7 @@
                 <w:sz w:val="32"/>
                 <w:szCs w:val="32"/>
               </w:rPr>
+              <w:lastRenderedPageBreak/>
               <w:t>Section, Paragraph</w:t>
             </w:r>
           </w:p>
@@ -1391,7 +2645,6 @@
                 <w:sz w:val="28"/>
                 <w:szCs w:val="32"/>
               </w:rPr>
-              <w:lastRenderedPageBreak/>
               <w:t>T.S.4.5.1.3 – Kramam</w:t>
             </w:r>
           </w:p>
@@ -2636,6 +3889,7 @@
                 <w:sz w:val="28"/>
                 <w:szCs w:val="32"/>
               </w:rPr>
+              <w:lastRenderedPageBreak/>
               <w:t>T.S.4.5.11.2 – Kramam</w:t>
             </w:r>
           </w:p>
@@ -2962,7 +4216,16 @@
           <w:bCs/>
           <w:sz w:val="32"/>
         </w:rPr>
-        <w:t>replaced with</w:t>
+        <w:t xml:space="preserve">replaced </w:t>
+      </w:r>
+      <w:proofErr w:type="gramStart"/>
+      <w:r>
+        <w:rPr>
+          <w:b/>
+          <w:bCs/>
+          <w:sz w:val="32"/>
+        </w:rPr>
+        <w:t>with</w:t>
       </w:r>
       <w:r>
         <w:rPr>
@@ -2984,6 +4247,7 @@
         </w:rPr>
         <w:t>"</w:t>
       </w:r>
+      <w:proofErr w:type="gramEnd"/>
       <w:r>
         <w:rPr>
           <w:rFonts w:ascii="BRH Malayalam" w:hAnsi="BRH Malayalam" w:cs="BRH Malayalam"/>
@@ -2995,6 +4259,7 @@
         </w:rPr>
         <w:t>q§T</w:t>
       </w:r>
+      <w:proofErr w:type="gramStart"/>
       <w:r>
         <w:rPr>
           <w:rFonts w:ascii="BRH Malayalam" w:hAnsi="BRH Malayalam" w:cs="BRH Malayalam"/>
@@ -3011,7 +4276,16 @@
           <w:bCs/>
           <w:sz w:val="32"/>
         </w:rPr>
-        <w:t>wherever applicable</w:t>
+        <w:t>wherever</w:t>
+      </w:r>
+      <w:proofErr w:type="gramEnd"/>
+      <w:r>
+        <w:rPr>
+          <w:b/>
+          <w:bCs/>
+          <w:sz w:val="32"/>
+        </w:rPr>
+        <w:t xml:space="preserve"> applicable</w:t>
       </w:r>
     </w:p>
     <w:p>
@@ -3335,7 +4609,6 @@
                 <w:sz w:val="32"/>
                 <w:szCs w:val="36"/>
               </w:rPr>
-              <w:lastRenderedPageBreak/>
               <w:t>None</w:t>
             </w:r>
           </w:p>

</xml_diff>